<commit_message>
add files cloud tec aws
</commit_message>
<xml_diff>
--- a/informe practica 02.docx
+++ b/informe practica 02.docx
@@ -90,7 +90,7 @@
               </wp:anchor>
             </w:drawing>
           </mc:Choice>
-          <mc:Fallback xmlns:oel="http://schemas.microsoft.com/office/2019/extlst" xmlns:w16cex="http://schemas.microsoft.com/office/word/2018/wordml/cex" xmlns:w16="http://schemas.microsoft.com/office/word/2018/wordml" xmlns:w16du="http://schemas.microsoft.com/office/word/2023/wordml/word16du" xmlns:w16sdtdh="http://schemas.microsoft.com/office/word/2020/wordml/sdtdatahash" xmlns:w16sdtfl="http://schemas.microsoft.com/office/word/2024/wordml/sdtformatlock">
+          <mc:Fallback xmlns:w16sdtfl="http://schemas.microsoft.com/office/word/2024/wordml/sdtformatlock" xmlns:w16sdtdh="http://schemas.microsoft.com/office/word/2020/wordml/sdtdatahash" xmlns:w16du="http://schemas.microsoft.com/office/word/2023/wordml/word16du" xmlns:w16="http://schemas.microsoft.com/office/word/2018/wordml" xmlns:w16cex="http://schemas.microsoft.com/office/word/2018/wordml/cex" xmlns:oel="http://schemas.microsoft.com/office/2019/extlst">
             <w:pict>
               <v:line w14:anchorId="79000A9E" id="Conector recto 11" o:spid="_x0000_s1026" style="position:absolute;flip:y;z-index:251662336;visibility:visible;mso-wrap-style:square;mso-width-percent:0;mso-height-percent:0;mso-wrap-distance-left:9pt;mso-wrap-distance-top:0;mso-wrap-distance-right:9pt;mso-wrap-distance-bottom:0;mso-position-horizontal:absolute;mso-position-horizontal-relative:text;mso-position-vertical:absolute;mso-position-vertical-relative:text;mso-width-percent:0;mso-height-percent:0;mso-width-relative:page;mso-height-relative:page" from="0,9.45pt" to="495pt,9.45pt" o:gfxdata="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" o:allowincell="f" strokeweight="4.5pt">
                 <v:stroke linestyle="thickThin"/>
@@ -444,7 +444,7 @@
               </wp:anchor>
             </w:drawing>
           </mc:Choice>
-          <mc:Fallback xmlns:oel="http://schemas.microsoft.com/office/2019/extlst" xmlns:w16cex="http://schemas.microsoft.com/office/word/2018/wordml/cex" xmlns:w16="http://schemas.microsoft.com/office/word/2018/wordml" xmlns:w16du="http://schemas.microsoft.com/office/word/2023/wordml/word16du" xmlns:w16sdtdh="http://schemas.microsoft.com/office/word/2020/wordml/sdtdatahash" xmlns:w16sdtfl="http://schemas.microsoft.com/office/word/2024/wordml/sdtformatlock">
+          <mc:Fallback xmlns:w16sdtfl="http://schemas.microsoft.com/office/word/2024/wordml/sdtformatlock" xmlns:w16sdtdh="http://schemas.microsoft.com/office/word/2020/wordml/sdtdatahash" xmlns:w16du="http://schemas.microsoft.com/office/word/2023/wordml/word16du" xmlns:w16="http://schemas.microsoft.com/office/word/2018/wordml" xmlns:w16cex="http://schemas.microsoft.com/office/word/2018/wordml/cex" xmlns:oel="http://schemas.microsoft.com/office/2019/extlst">
             <w:pict>
               <v:shapetype w14:anchorId="23E962EA" id="_x0000_t66" coordsize="21600,21600" o:spt="66" adj="5400,5400" path="m@0,l@0@1,21600@1,21600@2@0@2@0,21600,,10800xe">
                 <v:stroke joinstyle="miter"/>
@@ -542,7 +542,7 @@
               </wp:anchor>
             </w:drawing>
           </mc:Choice>
-          <mc:Fallback xmlns:oel="http://schemas.microsoft.com/office/2019/extlst" xmlns:w16cex="http://schemas.microsoft.com/office/word/2018/wordml/cex" xmlns:w16="http://schemas.microsoft.com/office/word/2018/wordml" xmlns:w16du="http://schemas.microsoft.com/office/word/2023/wordml/word16du" xmlns:w16sdtdh="http://schemas.microsoft.com/office/word/2020/wordml/sdtdatahash" xmlns:w16sdtfl="http://schemas.microsoft.com/office/word/2024/wordml/sdtformatlock">
+          <mc:Fallback xmlns:w16sdtfl="http://schemas.microsoft.com/office/word/2024/wordml/sdtformatlock" xmlns:w16sdtdh="http://schemas.microsoft.com/office/word/2020/wordml/sdtdatahash" xmlns:w16du="http://schemas.microsoft.com/office/word/2023/wordml/word16du" xmlns:w16="http://schemas.microsoft.com/office/word/2018/wordml" xmlns:w16cex="http://schemas.microsoft.com/office/word/2018/wordml/cex" xmlns:oel="http://schemas.microsoft.com/office/2019/extlst">
             <w:pict>
               <v:shapetype w14:anchorId="001D26AC" id="_x0000_t13" coordsize="21600,21600" o:spt="13" adj="16200,5400" path="m@0,l@0@1,0@1,0@2@0@2@0,21600,21600,10800xe">
                 <v:stroke joinstyle="miter"/>
@@ -21308,6 +21308,8 @@
               </w:rPr>
               <w:t>Optimización de costos con Amazon EC2</w:t>
             </w:r>
+            <w:bookmarkStart w:id="0" w:name="_GoBack"/>
+            <w:bookmarkEnd w:id="0"/>
           </w:p>
         </w:tc>
         <w:tc>
@@ -22457,17 +22459,6 @@
               </w:rPr>
               <w:t>EBS y EFS</w:t>
             </w:r>
-            <w:r>
-              <w:rPr>
-                <w:b w:val="0"/>
-                <w:sz w:val="22"/>
-                <w:szCs w:val="22"/>
-                <w:lang w:val="es-MX"/>
-              </w:rPr>
-              <w:t>.</w:t>
-            </w:r>
-            <w:bookmarkStart w:id="0" w:name="_GoBack"/>
-            <w:bookmarkEnd w:id="0"/>
           </w:p>
         </w:tc>
         <w:tc>
@@ -25378,7 +25369,7 @@
                     </wp:anchor>
                   </w:drawing>
                 </mc:Choice>
-                <mc:Fallback xmlns:oel="http://schemas.microsoft.com/office/2019/extlst" xmlns:w16cex="http://schemas.microsoft.com/office/word/2018/wordml/cex" xmlns:w16="http://schemas.microsoft.com/office/word/2018/wordml" xmlns:w16du="http://schemas.microsoft.com/office/word/2023/wordml/word16du" xmlns:w16sdtdh="http://schemas.microsoft.com/office/word/2020/wordml/sdtdatahash" xmlns:w16sdtfl="http://schemas.microsoft.com/office/word/2024/wordml/sdtformatlock">
+                <mc:Fallback xmlns:w16sdtfl="http://schemas.microsoft.com/office/word/2024/wordml/sdtformatlock" xmlns:w16sdtdh="http://schemas.microsoft.com/office/word/2020/wordml/sdtdatahash" xmlns:w16du="http://schemas.microsoft.com/office/word/2023/wordml/word16du" xmlns:w16="http://schemas.microsoft.com/office/word/2018/wordml" xmlns:w16cex="http://schemas.microsoft.com/office/word/2018/wordml/cex" xmlns:oel="http://schemas.microsoft.com/office/2019/extlst">
                   <w:pict>
                     <v:rect w14:anchorId="18B09586" id="Rectángulo 9" o:spid="_x0000_s1026" style="position:absolute;margin-left:456.15pt;margin-top:4.25pt;width:44.65pt;height:25.85pt;z-index:251674624;visibility:visible;mso-wrap-style:square;mso-wrap-distance-left:9pt;mso-wrap-distance-top:0;mso-wrap-distance-right:9pt;mso-wrap-distance-bottom:0;mso-position-horizontal:absolute;mso-position-horizontal-relative:text;mso-position-vertical:absolute;mso-position-vertical-relative:text;v-text-anchor:middle" o:gfxdata="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" filled="f" strokecolor="#09101d [484]" strokeweight="1pt"/>
                   </w:pict>
@@ -28475,6 +28466,43 @@
 </file>
 
 <file path=customXml/item1.xml><?xml version="1.0" encoding="utf-8"?>
+<p:properties xmlns:p="http://schemas.microsoft.com/office/2006/metadata/properties" xmlns:xsi="http://www.w3.org/2001/XMLSchema-instance" xmlns:pc="http://schemas.microsoft.com/office/infopath/2007/PartnerControls">
+  <documentManagement>
+    <TaxCatchAll xmlns="ee27a0f9-7ff9-4c05-b61a-f7053cc3ff56" xsi:nil="true"/>
+    <lcf76f155ced4ddcb4097134ff3c332f xmlns="8b0498ea-4bc6-4676-a87b-9cffe7f59fc7">
+      <Terms xmlns="http://schemas.microsoft.com/office/infopath/2007/PartnerControls"/>
+    </lcf76f155ced4ddcb4097134ff3c332f>
+    <Validado xmlns="8b0498ea-4bc6-4676-a87b-9cffe7f59fc7">false</Validado>
+    <Tarea3 xmlns="8b0498ea-4bc6-4676-a87b-9cffe7f59fc7" xsi:nil="true"/>
+    <NumTareas xmlns="8b0498ea-4bc6-4676-a87b-9cffe7f59fc7" xsi:nil="true"/>
+    <Maquetado xmlns="8b0498ea-4bc6-4676-a87b-9cffe7f59fc7">false</Maquetado>
+    <Validado_v2 xmlns="8b0498ea-4bc6-4676-a87b-9cffe7f59fc7" xsi:nil="true"/>
+    <FECHAYHORA xmlns="8b0498ea-4bc6-4676-a87b-9cffe7f59fc7" xsi:nil="true"/>
+    <Entregado xmlns="8b0498ea-4bc6-4676-a87b-9cffe7f59fc7">false</Entregado>
+    <Asignado xmlns="8b0498ea-4bc6-4676-a87b-9cffe7f59fc7">true</Asignado>
+    <Observado xmlns="8b0498ea-4bc6-4676-a87b-9cffe7f59fc7">false</Observado>
+    <Virtualizado xmlns="8b0498ea-4bc6-4676-a87b-9cffe7f59fc7">false</Virtualizado>
+    <SharedWithUsers xmlns="ee27a0f9-7ff9-4c05-b61a-f7053cc3ff56">
+      <UserInfo>
+        <DisplayName/>
+        <AccountId xsi:nil="true"/>
+        <AccountType/>
+      </UserInfo>
+    </SharedWithUsers>
+  </documentManagement>
+</p:properties>
+</file>
+
+<file path=customXml/item2.xml><?xml version="1.0" encoding="utf-8"?>
+<?mso-contentType ?>
+<FormTemplates xmlns="http://schemas.microsoft.com/sharepoint/v3/contenttype/forms">
+  <Display>DocumentLibraryForm</Display>
+  <Edit>DocumentLibraryForm</Edit>
+  <New>DocumentLibraryForm</New>
+</FormTemplates>
+</file>
+
+<file path=customXml/item3.xml><?xml version="1.0" encoding="utf-8"?>
 <ct:contentTypeSchema xmlns:ct="http://schemas.microsoft.com/office/2006/metadata/contentType" xmlns:ma="http://schemas.microsoft.com/office/2006/metadata/properties/metaAttributes" ct:_="" ma:_="" ma:contentTypeName="Document" ma:contentTypeID="0x010100795EFC9A07ECD140851F1B2ABF131888" ma:contentTypeVersion="41" ma:contentTypeDescription="Create a new document." ma:contentTypeScope="" ma:versionID="c13993bf92cd8618b9d03b2373163b65">
   <xsd:schema xmlns:xsd="http://www.w3.org/2001/XMLSchema" xmlns:xs="http://www.w3.org/2001/XMLSchema" xmlns:p="http://schemas.microsoft.com/office/2006/metadata/properties" xmlns:ns2="8b0498ea-4bc6-4676-a87b-9cffe7f59fc7" xmlns:ns3="ee27a0f9-7ff9-4c05-b61a-f7053cc3ff56" targetNamespace="http://schemas.microsoft.com/office/2006/metadata/properties" ma:root="true" ma:fieldsID="2a52140dc6e7226b1a07c99ff8b88bdb" ns2:_="" ns3:_="">
     <xsd:import namespace="8b0498ea-4bc6-4676-a87b-9cffe7f59fc7"/>
@@ -28798,48 +28826,30 @@
 </ct:contentTypeSchema>
 </file>
 
-<file path=customXml/item2.xml><?xml version="1.0" encoding="utf-8"?>
-<?mso-contentType ?>
-<FormTemplates xmlns="http://schemas.microsoft.com/sharepoint/v3/contenttype/forms">
-  <Display>DocumentLibraryForm</Display>
-  <Edit>DocumentLibraryForm</Edit>
-  <New>DocumentLibraryForm</New>
-</FormTemplates>
-</file>
-
-<file path=customXml/item3.xml><?xml version="1.0" encoding="utf-8"?>
-<p:properties xmlns:p="http://schemas.microsoft.com/office/2006/metadata/properties" xmlns:xsi="http://www.w3.org/2001/XMLSchema-instance" xmlns:pc="http://schemas.microsoft.com/office/infopath/2007/PartnerControls">
-  <documentManagement>
-    <TaxCatchAll xmlns="ee27a0f9-7ff9-4c05-b61a-f7053cc3ff56" xsi:nil="true"/>
-    <lcf76f155ced4ddcb4097134ff3c332f xmlns="8b0498ea-4bc6-4676-a87b-9cffe7f59fc7">
-      <Terms xmlns="http://schemas.microsoft.com/office/infopath/2007/PartnerControls"/>
-    </lcf76f155ced4ddcb4097134ff3c332f>
-    <Validado xmlns="8b0498ea-4bc6-4676-a87b-9cffe7f59fc7">false</Validado>
-    <Tarea3 xmlns="8b0498ea-4bc6-4676-a87b-9cffe7f59fc7" xsi:nil="true"/>
-    <NumTareas xmlns="8b0498ea-4bc6-4676-a87b-9cffe7f59fc7" xsi:nil="true"/>
-    <Maquetado xmlns="8b0498ea-4bc6-4676-a87b-9cffe7f59fc7">false</Maquetado>
-    <Validado_v2 xmlns="8b0498ea-4bc6-4676-a87b-9cffe7f59fc7" xsi:nil="true"/>
-    <FECHAYHORA xmlns="8b0498ea-4bc6-4676-a87b-9cffe7f59fc7" xsi:nil="true"/>
-    <Entregado xmlns="8b0498ea-4bc6-4676-a87b-9cffe7f59fc7">false</Entregado>
-    <Asignado xmlns="8b0498ea-4bc6-4676-a87b-9cffe7f59fc7">true</Asignado>
-    <Observado xmlns="8b0498ea-4bc6-4676-a87b-9cffe7f59fc7">false</Observado>
-    <Virtualizado xmlns="8b0498ea-4bc6-4676-a87b-9cffe7f59fc7">false</Virtualizado>
-    <SharedWithUsers xmlns="ee27a0f9-7ff9-4c05-b61a-f7053cc3ff56">
-      <UserInfo>
-        <DisplayName/>
-        <AccountId xsi:nil="true"/>
-        <AccountType/>
-      </UserInfo>
-    </SharedWithUsers>
-  </documentManagement>
-</p:properties>
-</file>
-
 <file path=customXml/item4.xml><?xml version="1.0" encoding="utf-8"?>
 <b:Sources xmlns:b="http://schemas.openxmlformats.org/officeDocument/2006/bibliography" xmlns="http://schemas.openxmlformats.org/officeDocument/2006/bibliography" SelectedStyle="\APASixthEditionOfficeOnline.xsl" StyleName="APA" Version="6"/>
 </file>
 
 <file path=customXml/itemProps1.xml><?xml version="1.0" encoding="utf-8"?>
+<ds:datastoreItem xmlns:ds="http://schemas.openxmlformats.org/officeDocument/2006/customXml" ds:itemID="{8B365F48-C2B5-4E3D-BA44-D9D74DBA7350}">
+  <ds:schemaRefs>
+    <ds:schemaRef ds:uri="http://schemas.microsoft.com/office/2006/metadata/properties"/>
+    <ds:schemaRef ds:uri="http://schemas.microsoft.com/office/infopath/2007/PartnerControls"/>
+    <ds:schemaRef ds:uri="ee27a0f9-7ff9-4c05-b61a-f7053cc3ff56"/>
+    <ds:schemaRef ds:uri="8b0498ea-4bc6-4676-a87b-9cffe7f59fc7"/>
+  </ds:schemaRefs>
+</ds:datastoreItem>
+</file>
+
+<file path=customXml/itemProps2.xml><?xml version="1.0" encoding="utf-8"?>
+<ds:datastoreItem xmlns:ds="http://schemas.openxmlformats.org/officeDocument/2006/customXml" ds:itemID="{21DA1112-85AB-4ED2-BDE2-25A2490B57E1}">
+  <ds:schemaRefs>
+    <ds:schemaRef ds:uri="http://schemas.microsoft.com/sharepoint/v3/contenttype/forms"/>
+  </ds:schemaRefs>
+</ds:datastoreItem>
+</file>
+
+<file path=customXml/itemProps3.xml><?xml version="1.0" encoding="utf-8"?>
 <ds:datastoreItem xmlns:ds="http://schemas.openxmlformats.org/officeDocument/2006/customXml" ds:itemID="{D7ECF071-20DC-4082-9978-FE8D605D707A}">
   <ds:schemaRefs>
     <ds:schemaRef ds:uri="http://schemas.microsoft.com/office/2006/metadata/contentType"/>
@@ -28858,27 +28868,8 @@
 </ds:datastoreItem>
 </file>
 
-<file path=customXml/itemProps2.xml><?xml version="1.0" encoding="utf-8"?>
-<ds:datastoreItem xmlns:ds="http://schemas.openxmlformats.org/officeDocument/2006/customXml" ds:itemID="{21DA1112-85AB-4ED2-BDE2-25A2490B57E1}">
-  <ds:schemaRefs>
-    <ds:schemaRef ds:uri="http://schemas.microsoft.com/sharepoint/v3/contenttype/forms"/>
-  </ds:schemaRefs>
-</ds:datastoreItem>
-</file>
-
-<file path=customXml/itemProps3.xml><?xml version="1.0" encoding="utf-8"?>
-<ds:datastoreItem xmlns:ds="http://schemas.openxmlformats.org/officeDocument/2006/customXml" ds:itemID="{8B365F48-C2B5-4E3D-BA44-D9D74DBA7350}">
-  <ds:schemaRefs>
-    <ds:schemaRef ds:uri="http://schemas.microsoft.com/office/2006/metadata/properties"/>
-    <ds:schemaRef ds:uri="http://schemas.microsoft.com/office/infopath/2007/PartnerControls"/>
-    <ds:schemaRef ds:uri="ee27a0f9-7ff9-4c05-b61a-f7053cc3ff56"/>
-    <ds:schemaRef ds:uri="8b0498ea-4bc6-4676-a87b-9cffe7f59fc7"/>
-  </ds:schemaRefs>
-</ds:datastoreItem>
-</file>
-
 <file path=customXml/itemProps4.xml><?xml version="1.0" encoding="utf-8"?>
-<ds:datastoreItem xmlns:ds="http://schemas.openxmlformats.org/officeDocument/2006/customXml" ds:itemID="{B163E35F-C245-40B8-B39A-799A62425218}">
+<ds:datastoreItem xmlns:ds="http://schemas.openxmlformats.org/officeDocument/2006/customXml" ds:itemID="{ED22698D-FAC8-4F42-A167-BFAFA22B141E}">
   <ds:schemaRefs>
     <ds:schemaRef ds:uri="http://schemas.openxmlformats.org/officeDocument/2006/bibliography"/>
   </ds:schemaRefs>

</xml_diff>